<commit_message>
Update Supplementary Table S2
</commit_message>
<xml_diff>
--- a/supplementary-material/Supplementary Table S2.docx
+++ b/supplementary-material/Supplementary Table S2.docx
@@ -622,6 +622,24 @@
                 <w:sz w:val="20"/>
                 <w:szCs w:val="20"/>
               </w:rPr>
+              <w:t>P2 bilateral action duration</w:t>
+            </w:r>
+          </w:p>
+          <w:p>
+            <w:pPr>
+              <w:jc w:val="center"/>
+              <w:rPr>
+                <w:rFonts w:ascii="Times New Roman" w:eastAsia="DengXian" w:hAnsi="Times New Roman" w:cs="Times New Roman"/>
+                <w:sz w:val="20"/>
+                <w:szCs w:val="20"/>
+              </w:rPr>
+            </w:pPr>
+            <w:r>
+              <w:rPr>
+                <w:rFonts w:ascii="Times New Roman" w:eastAsia="DengXian" w:hAnsi="Times New Roman" w:cs="Times New Roman"/>
+                <w:sz w:val="20"/>
+                <w:szCs w:val="20"/>
+              </w:rPr>
               <w:t xml:space="preserve">P2 </w:t>
             </w:r>
             <w:r>
@@ -630,15 +648,7 @@
                 <w:sz w:val="20"/>
                 <w:szCs w:val="20"/>
               </w:rPr>
-              <w:t>mean bilateral push-action duratio</w:t>
-            </w:r>
-            <w:r>
-              <w:rPr>
-                <w:rFonts w:ascii="Times New Roman" w:eastAsia="DengXian" w:hAnsi="Times New Roman" w:cs="Times New Roman"/>
-                <w:sz w:val="20"/>
-                <w:szCs w:val="20"/>
-              </w:rPr>
-              <w:t>n</w:t>
+              <w:t>inter-action gap</w:t>
             </w:r>
           </w:p>
         </w:tc>
@@ -1515,15 +1525,7 @@
                 <w:sz w:val="20"/>
                 <w:szCs w:val="20"/>
               </w:rPr>
-              <w:t>bilateral</w:t>
-            </w:r>
-            <w:r>
-              <w:rPr>
-                <w:rFonts w:ascii="Times New Roman" w:eastAsia="DengXian" w:hAnsi="Times New Roman" w:cs="Times New Roman"/>
-                <w:sz w:val="20"/>
-                <w:szCs w:val="20"/>
-              </w:rPr>
-              <w:t xml:space="preserve"> </w:t>
+              <w:t xml:space="preserve">bilateral </w:t>
             </w:r>
             <w:r>
               <w:rPr>
@@ -2495,6 +2497,7 @@
   <w:style w:type="character" w:default="1" w:styleId="a0">
     <w:name w:val="Default Paragraph Font"/>
     <w:uiPriority w:val="1"/>
+    <w:semiHidden/>
     <w:unhideWhenUsed/>
   </w:style>
   <w:style w:type="table" w:default="1" w:styleId="a1">

</xml_diff>

<commit_message>
Update terminology in Supplementary Table S2
</commit_message>
<xml_diff>
--- a/supplementary-material/Supplementary Table S2.docx
+++ b/supplementary-material/Supplementary Table S2.docx
@@ -1360,7 +1360,23 @@
                 <w:sz w:val="20"/>
                 <w:szCs w:val="20"/>
               </w:rPr>
-              <w:t>Between-action consistency and within-action movement smoothness (</w:t>
+              <w:t xml:space="preserve">Between-action consistency and within-action movement </w:t>
+            </w:r>
+            <w:r>
+              <w:rPr>
+                <w:rFonts w:ascii="Times New Roman" w:eastAsia="仿宋" w:hAnsi="Times New Roman" w:cs="Times New Roman"/>
+                <w:sz w:val="20"/>
+                <w:szCs w:val="20"/>
+              </w:rPr>
+              <w:t>dynamics</w:t>
+            </w:r>
+            <w:r>
+              <w:rPr>
+                <w:rFonts w:ascii="Times New Roman" w:eastAsia="仿宋" w:hAnsi="Times New Roman" w:cs="Times New Roman"/>
+                <w:sz w:val="20"/>
+                <w:szCs w:val="20"/>
+              </w:rPr>
+              <w:t xml:space="preserve"> (</w:t>
             </w:r>
             <m:oMath>
               <m:sSub>

</xml_diff>

<commit_message>
Clarify P2 action definition in Supplementary Table S2
</commit_message>
<xml_diff>
--- a/supplementary-material/Supplementary Table S2.docx
+++ b/supplementary-material/Supplementary Table S2.docx
@@ -1845,6 +1845,7 @@
       <w:pPr>
         <w:widowControl w:val="0"/>
         <w:shd w:val="clear" w:color="auto" w:fill="FFFFFF"/>
+        <w:spacing w:line="240" w:lineRule="auto"/>
         <w:jc w:val="both"/>
         <w:rPr>
           <w:rFonts w:ascii="Times New Roman" w:eastAsia="仿宋" w:hAnsi="Times New Roman" w:cs="Times New Roman"/>
@@ -1855,6 +1856,7 @@
           <w:szCs w:val="20"/>
           <w14:ligatures w14:val="standardContextual"/>
         </w:rPr>
+        <w:snapToGrid w:val="0"/>
       </w:pPr>
       <w:r>
         <w:rPr>
@@ -1895,6 +1897,16 @@
           <w:szCs w:val="20"/>
         </w:rPr>
         <w:t>.</w:t>
+      </w:r>
+      <w:r>
+        <w:rPr>
+          <w:rFonts w:ascii="Times New Roman" w:eastAsia="仿宋" w:hAnsi="Times New Roman" w:cs="Times New Roman"/>
+          <w:i/>
+          <w:iCs/>
+          <w:sz w:val="20"/>
+          <w:szCs w:val="20"/>
+        </w:rPr>
+        <w:t xml:space="preserve"> Each P2 action was defined as a continuous fabric-grasp episode, beginning when either hand first grasped the fabric and ending when neither hand maintained a grasp. Each recorded episode counted as one action, with bilateral participation assessed separately.</w:t>
       </w:r>
     </w:p>
     <w:sectPr>

</xml_diff>